<commit_message>
feat: optimize station list table layout, restore general info tab, and clean address suffix
</commit_message>
<xml_diff>
--- a/tvt3_v2/public/templates/THANH_LY_KY_LAI_MAT_BANG.docx
+++ b/tvt3_v2/public/templates/THANH_LY_KY_LAI_MAT_BANG.docx
@@ -4035,7 +4035,7 @@
           <w:b/>
           <w:bCs/>
         </w:rPr>
-        <w:t>Địa chỉ trạm: {{ADDRESS_OLD</w:t>
+        <w:t>Địa chỉ trạm: {{ADDRESS_OLD}} (</w:t>
       </w:r>
       <w:r>
         <w:rPr>
@@ -4048,7 +4048,7 @@
           <w:szCs w:val="28"/>
           <w:lang w:val="da-DK"/>
         </w:rPr>
-        <w:t>{{ADDRESS_NEW}}</w:t>
+        <w:t>{{ADDRESS_NEW}})</w:t>
       </w:r>
       <w:r>
         <w:rPr>

</xml_diff>